<commit_message>
Add live demo links
</commit_message>
<xml_diff>
--- a/docs/Fuel_Route_Planner_Submission.docx
+++ b/docs/Fuel_Route_Planner_Submission.docx
@@ -166,6 +166,80 @@
                 <w:sz w:val="19"/>
               </w:rPr>
               <w:t>&lt;paste Loom URL here&gt;</w:t>
+            </w:r>
+          </w:p>
+        </w:tc>
+      </w:tr>
+      <w:tr>
+        <w:tc>
+          <w:tcPr>
+            <w:tcW w:type="dxa" w:w="2736"/>
+          </w:tcPr>
+          <w:p>
+            <w:pPr>
+              <w:spacing w:after="0"/>
+            </w:pPr>
+            <w:r/>
+            <w:r>
+              <w:rPr>
+                <w:sz w:val="19"/>
+              </w:rPr>
+              <w:t>Live demo (map)</w:t>
+            </w:r>
+          </w:p>
+        </w:tc>
+        <w:tc>
+          <w:tcPr>
+            <w:tcW w:type="dxa" w:w="6912"/>
+          </w:tcPr>
+          <w:p>
+            <w:pPr>
+              <w:spacing w:after="0"/>
+            </w:pPr>
+            <w:r/>
+            <w:r>
+              <w:rPr>
+                <w:sz w:val="19"/>
+              </w:rPr>
+              <w:t>https://route-planner-ivory.vercel.app/map/</w:t>
+            </w:r>
+          </w:p>
+        </w:tc>
+      </w:tr>
+      <w:tr>
+        <w:tc>
+          <w:tcPr>
+            <w:tcW w:type="dxa" w:w="2736"/>
+            <w:shd w:val="clear" w:color="auto" w:fill="F1F5F9"/>
+          </w:tcPr>
+          <w:p>
+            <w:pPr>
+              <w:spacing w:after="0"/>
+            </w:pPr>
+            <w:r/>
+            <w:r>
+              <w:rPr>
+                <w:sz w:val="19"/>
+              </w:rPr>
+              <w:t>Live API</w:t>
+            </w:r>
+          </w:p>
+        </w:tc>
+        <w:tc>
+          <w:tcPr>
+            <w:tcW w:type="dxa" w:w="6912"/>
+            <w:shd w:val="clear" w:color="auto" w:fill="F1F5F9"/>
+          </w:tcPr>
+          <w:p>
+            <w:pPr>
+              <w:spacing w:after="0"/>
+            </w:pPr>
+            <w:r/>
+            <w:r>
+              <w:rPr>
+                <w:sz w:val="19"/>
+              </w:rPr>
+              <w:t>https://route-planner-ivory.vercel.app/api/v1/route/?start=Chicago, IL&amp;finish=Houston, TX</w:t>
             </w:r>
           </w:p>
         </w:tc>
@@ -1917,6 +1991,18 @@
     </w:p>
     <w:p>
       <w:pPr>
+        <w:spacing w:after="120"/>
+      </w:pPr>
+      <w:r>
+        <w:rPr>
+          <w:b w:val="0"/>
+          <w:i w:val="0"/>
+        </w:rPr>
+        <w:t>Try it live: the same endpoints are deployed at https://route-planner-ivory.vercel.app (Vercel free tier, so the first request after an idle period can take a few seconds).</w:t>
+      </w:r>
+    </w:p>
+    <w:p>
+      <w:pPr>
         <w:spacing w:after="80"/>
       </w:pPr>
       <w:r>

</xml_diff>